<commit_message>
new data + corection jury bloc 1-2
</commit_message>
<xml_diff>
--- a/AIA_Architecte_Intelligence_Artificielle/Bloc_1_Gouvernance_Donnees/Documents_modifiables/Step2 _Designing_Spotifys_Data_Governance_Framework.docx
+++ b/AIA_Architecte_Intelligence_Artificielle/Bloc_1_Gouvernance_Donnees/Documents_modifiables/Step2 _Designing_Spotifys_Data_Governance_Framework.docx
@@ -42,27 +42,38 @@
           <w:szCs w:val="20"/>
           <w:u w:val="single"/>
         </w:rPr>
-        <w:t>Politique de Gouvernance des Données – Spotify</w:t>
-      </w:r>
-      <w:r>
+        <w:t xml:space="preserve">Politique de Gouvernance des Données – Spotify - </w:t>
+      </w:r>
+      <w:r>
+        <w:rPr>
+          <w:i/>
+          <w:iCs/>
+          <w:sz w:val="20"/>
+          <w:szCs w:val="20"/>
+          <w:u w:val="single"/>
+        </w:rPr>
+        <w:t>Version 1.0 – Mai 2025</w:t>
+      </w:r>
+    </w:p>
+    <w:p>
+      <w:pPr>
+        <w:ind w:firstLine="708"/>
+        <w:jc w:val="both"/>
         <w:rPr>
           <w:b/>
           <w:bCs/>
           <w:sz w:val="20"/>
           <w:szCs w:val="20"/>
-          <w:u w:val="single"/>
-        </w:rPr>
-        <w:t xml:space="preserve"> - </w:t>
-      </w:r>
-      <w:r>
-        <w:rPr>
-          <w:i/>
-          <w:iCs/>
-          <w:sz w:val="20"/>
-          <w:szCs w:val="20"/>
-          <w:u w:val="single"/>
-        </w:rPr>
-        <w:t>Version 1.0 – Mai 2025</w:t>
+        </w:rPr>
+      </w:pPr>
+      <w:r>
+        <w:rPr>
+          <w:b/>
+          <w:bCs/>
+          <w:sz w:val="20"/>
+          <w:szCs w:val="20"/>
+        </w:rPr>
+        <w:t>Préambule</w:t>
       </w:r>
     </w:p>
     <w:p>
@@ -70,20 +81,106 @@
         <w:ind w:firstLine="708"/>
         <w:jc w:val="both"/>
         <w:rPr>
-          <w:b/>
-          <w:bCs/>
-          <w:sz w:val="20"/>
-          <w:szCs w:val="20"/>
-        </w:rPr>
-      </w:pPr>
-      <w:r>
-        <w:rPr>
-          <w:b/>
-          <w:bCs/>
-          <w:sz w:val="20"/>
-          <w:szCs w:val="20"/>
-        </w:rPr>
-        <w:t>Préambule</w:t>
+          <w:sz w:val="20"/>
+          <w:szCs w:val="20"/>
+        </w:rPr>
+      </w:pPr>
+      <w:r>
+        <w:rPr>
+          <w:sz w:val="20"/>
+          <w:szCs w:val="20"/>
+        </w:rPr>
+        <w:t>Chez Spotify, la donnée n’est pas qu’un actif technique</w:t>
+      </w:r>
+      <w:r>
+        <w:rPr>
+          <w:rFonts w:ascii="Arial" w:hAnsi="Arial" w:cs="Arial"/>
+          <w:sz w:val="20"/>
+          <w:szCs w:val="20"/>
+        </w:rPr>
+        <w:t> </w:t>
+      </w:r>
+      <w:r>
+        <w:rPr>
+          <w:sz w:val="20"/>
+          <w:szCs w:val="20"/>
+        </w:rPr>
+        <w:t>: elle est au c</w:t>
+      </w:r>
+      <w:r>
+        <w:rPr>
+          <w:rFonts w:ascii="Aptos" w:hAnsi="Aptos" w:cs="Aptos"/>
+          <w:sz w:val="20"/>
+          <w:szCs w:val="20"/>
+        </w:rPr>
+        <w:t>œ</w:t>
+      </w:r>
+      <w:r>
+        <w:rPr>
+          <w:sz w:val="20"/>
+          <w:szCs w:val="20"/>
+        </w:rPr>
+        <w:t>ur de notre promesse utilisateur, de notre performance et de notre innovation. Avec plus de 450 millions d</w:t>
+      </w:r>
+      <w:r>
+        <w:rPr>
+          <w:rFonts w:ascii="Aptos" w:hAnsi="Aptos" w:cs="Aptos"/>
+          <w:sz w:val="20"/>
+          <w:szCs w:val="20"/>
+        </w:rPr>
+        <w:t>’</w:t>
+      </w:r>
+      <w:r>
+        <w:rPr>
+          <w:sz w:val="20"/>
+          <w:szCs w:val="20"/>
+        </w:rPr>
+        <w:t>utilisateurs dans 180 pays, nous portons une responsabilit</w:t>
+      </w:r>
+      <w:r>
+        <w:rPr>
+          <w:rFonts w:ascii="Aptos" w:hAnsi="Aptos" w:cs="Aptos"/>
+          <w:sz w:val="20"/>
+          <w:szCs w:val="20"/>
+        </w:rPr>
+        <w:t>é</w:t>
+      </w:r>
+      <w:r>
+        <w:rPr>
+          <w:sz w:val="20"/>
+          <w:szCs w:val="20"/>
+        </w:rPr>
+        <w:t xml:space="preserve"> particuli</w:t>
+      </w:r>
+      <w:r>
+        <w:rPr>
+          <w:rFonts w:ascii="Aptos" w:hAnsi="Aptos" w:cs="Aptos"/>
+          <w:sz w:val="20"/>
+          <w:szCs w:val="20"/>
+        </w:rPr>
+        <w:t>è</w:t>
+      </w:r>
+      <w:r>
+        <w:rPr>
+          <w:sz w:val="20"/>
+          <w:szCs w:val="20"/>
+        </w:rPr>
+        <w:t>re dans la gestion de l</w:t>
+      </w:r>
+      <w:r>
+        <w:rPr>
+          <w:rFonts w:ascii="Aptos" w:hAnsi="Aptos" w:cs="Aptos"/>
+          <w:sz w:val="20"/>
+          <w:szCs w:val="20"/>
+        </w:rPr>
+        <w:t>’</w:t>
+      </w:r>
+      <w:r>
+        <w:rPr>
+          <w:sz w:val="20"/>
+          <w:szCs w:val="20"/>
+        </w:rPr>
+        <w:t>information. Cette politique formalise notre engagement collectif à garantir une gouvernance des données éthique, fiable et conforme, au service de notre stratégie et de nos parties prenantes.</w:t>
       </w:r>
     </w:p>
     <w:p>
@@ -95,170 +192,6 @@
           <w:szCs w:val="20"/>
         </w:rPr>
       </w:pPr>
-      <w:r>
-        <w:rPr>
-          <w:sz w:val="20"/>
-          <w:szCs w:val="20"/>
-        </w:rPr>
-        <w:t xml:space="preserve">Chez </w:t>
-      </w:r>
-      <w:r>
-        <w:rPr>
-          <w:b/>
-          <w:bCs/>
-          <w:sz w:val="20"/>
-          <w:szCs w:val="20"/>
-        </w:rPr>
-        <w:t>Spotify</w:t>
-      </w:r>
-      <w:r>
-        <w:rPr>
-          <w:sz w:val="20"/>
-          <w:szCs w:val="20"/>
-        </w:rPr>
-        <w:t>, la donnée n’est pas qu’un actif technique</w:t>
-      </w:r>
-      <w:r>
-        <w:rPr>
-          <w:rFonts w:ascii="Arial" w:hAnsi="Arial" w:cs="Arial"/>
-          <w:sz w:val="20"/>
-          <w:szCs w:val="20"/>
-        </w:rPr>
-        <w:t> </w:t>
-      </w:r>
-      <w:r>
-        <w:rPr>
-          <w:sz w:val="20"/>
-          <w:szCs w:val="20"/>
-        </w:rPr>
-        <w:t>: elle est au c</w:t>
-      </w:r>
-      <w:r>
-        <w:rPr>
-          <w:rFonts w:ascii="Aptos" w:hAnsi="Aptos" w:cs="Aptos"/>
-          <w:sz w:val="20"/>
-          <w:szCs w:val="20"/>
-        </w:rPr>
-        <w:t>œ</w:t>
-      </w:r>
-      <w:r>
-        <w:rPr>
-          <w:sz w:val="20"/>
-          <w:szCs w:val="20"/>
-        </w:rPr>
-        <w:t>ur de notre promesse utilisateur, de notre performance et de notre innovation. Avec plus de 450 millions d</w:t>
-      </w:r>
-      <w:r>
-        <w:rPr>
-          <w:rFonts w:ascii="Aptos" w:hAnsi="Aptos" w:cs="Aptos"/>
-          <w:sz w:val="20"/>
-          <w:szCs w:val="20"/>
-        </w:rPr>
-        <w:t>’</w:t>
-      </w:r>
-      <w:r>
-        <w:rPr>
-          <w:sz w:val="20"/>
-          <w:szCs w:val="20"/>
-        </w:rPr>
-        <w:t>utilisateurs dans 180 pays, nous portons une responsabilit</w:t>
-      </w:r>
-      <w:r>
-        <w:rPr>
-          <w:rFonts w:ascii="Aptos" w:hAnsi="Aptos" w:cs="Aptos"/>
-          <w:sz w:val="20"/>
-          <w:szCs w:val="20"/>
-        </w:rPr>
-        <w:t>é</w:t>
-      </w:r>
-      <w:r>
-        <w:rPr>
-          <w:sz w:val="20"/>
-          <w:szCs w:val="20"/>
-        </w:rPr>
-        <w:t xml:space="preserve"> particuli</w:t>
-      </w:r>
-      <w:r>
-        <w:rPr>
-          <w:rFonts w:ascii="Aptos" w:hAnsi="Aptos" w:cs="Aptos"/>
-          <w:sz w:val="20"/>
-          <w:szCs w:val="20"/>
-        </w:rPr>
-        <w:t>è</w:t>
-      </w:r>
-      <w:r>
-        <w:rPr>
-          <w:sz w:val="20"/>
-          <w:szCs w:val="20"/>
-        </w:rPr>
-        <w:t>re dans la gestion de l</w:t>
-      </w:r>
-      <w:r>
-        <w:rPr>
-          <w:rFonts w:ascii="Aptos" w:hAnsi="Aptos" w:cs="Aptos"/>
-          <w:sz w:val="20"/>
-          <w:szCs w:val="20"/>
-        </w:rPr>
-        <w:t>’</w:t>
-      </w:r>
-      <w:r>
-        <w:rPr>
-          <w:sz w:val="20"/>
-          <w:szCs w:val="20"/>
-        </w:rPr>
-        <w:t xml:space="preserve">information. Cette politique formalise notre </w:t>
-      </w:r>
-      <w:r>
-        <w:rPr>
-          <w:b/>
-          <w:bCs/>
-          <w:sz w:val="20"/>
-          <w:szCs w:val="20"/>
-        </w:rPr>
-        <w:t>engagement collectif</w:t>
-      </w:r>
-      <w:r>
-        <w:rPr>
-          <w:sz w:val="20"/>
-          <w:szCs w:val="20"/>
-        </w:rPr>
-        <w:t xml:space="preserve"> à garantir une </w:t>
-      </w:r>
-      <w:r>
-        <w:rPr>
-          <w:b/>
-          <w:bCs/>
-          <w:sz w:val="20"/>
-          <w:szCs w:val="20"/>
-        </w:rPr>
-        <w:t>gouvernance des données éthique, fiable et conforme</w:t>
-      </w:r>
-      <w:r>
-        <w:rPr>
-          <w:sz w:val="20"/>
-          <w:szCs w:val="20"/>
-        </w:rPr>
-        <w:t>, au service de notre stratégie et de nos parties prenantes.</w:t>
-      </w:r>
-    </w:p>
-    <w:p>
-      <w:pPr>
-        <w:ind w:firstLine="708"/>
-        <w:jc w:val="both"/>
-        <w:rPr>
-          <w:sz w:val="20"/>
-          <w:szCs w:val="20"/>
-        </w:rPr>
-      </w:pPr>
-      <w:r>
-        <w:rPr>
-          <w:sz w:val="20"/>
-          <w:szCs w:val="20"/>
-        </w:rPr>
-        <w:pict w14:anchorId="62B29C25">
-          <v:rect id="_x0000_i1348" style="width:0;height:1.5pt" o:hralign="center" o:hrstd="t" o:hr="t" fillcolor="#a0a0a0" stroked="f"/>
-        </w:pict>
-      </w:r>
     </w:p>
     <w:p>
       <w:pPr>
@@ -330,23 +263,7 @@
           <w:sz w:val="20"/>
           <w:szCs w:val="20"/>
         </w:rPr>
-        <w:t xml:space="preserve">Définir les </w:t>
-      </w:r>
-      <w:r>
-        <w:rPr>
-          <w:b/>
-          <w:bCs/>
-          <w:sz w:val="20"/>
-          <w:szCs w:val="20"/>
-        </w:rPr>
-        <w:t>principes directeurs</w:t>
-      </w:r>
-      <w:r>
-        <w:rPr>
-          <w:sz w:val="20"/>
-          <w:szCs w:val="20"/>
-        </w:rPr>
-        <w:t xml:space="preserve"> de la gouvernance des données chez Spotify.</w:t>
+        <w:t>Définir les principes directeurs de la gouvernance des données chez Spotify.</w:t>
       </w:r>
     </w:p>
     <w:p>
@@ -366,71 +283,7 @@
           <w:sz w:val="20"/>
           <w:szCs w:val="20"/>
         </w:rPr>
-        <w:t xml:space="preserve">Assurer la </w:t>
-      </w:r>
-      <w:r>
-        <w:rPr>
-          <w:b/>
-          <w:bCs/>
-          <w:sz w:val="20"/>
-          <w:szCs w:val="20"/>
-        </w:rPr>
-        <w:t>qualité</w:t>
-      </w:r>
-      <w:r>
-        <w:rPr>
-          <w:sz w:val="20"/>
-          <w:szCs w:val="20"/>
-        </w:rPr>
-        <w:t xml:space="preserve">, la </w:t>
-      </w:r>
-      <w:r>
-        <w:rPr>
-          <w:b/>
-          <w:bCs/>
-          <w:sz w:val="20"/>
-          <w:szCs w:val="20"/>
-        </w:rPr>
-        <w:t>sécurité</w:t>
-      </w:r>
-      <w:r>
-        <w:rPr>
-          <w:sz w:val="20"/>
-          <w:szCs w:val="20"/>
-        </w:rPr>
-        <w:t xml:space="preserve">, la </w:t>
-      </w:r>
-      <w:r>
-        <w:rPr>
-          <w:b/>
-          <w:bCs/>
-          <w:sz w:val="20"/>
-          <w:szCs w:val="20"/>
-        </w:rPr>
-        <w:t>traçabilité</w:t>
-      </w:r>
-      <w:r>
-        <w:rPr>
-          <w:sz w:val="20"/>
-          <w:szCs w:val="20"/>
-        </w:rPr>
-        <w:t xml:space="preserve"> et la </w:t>
-      </w:r>
-      <w:r>
-        <w:rPr>
-          <w:b/>
-          <w:bCs/>
-          <w:sz w:val="20"/>
-          <w:szCs w:val="20"/>
-        </w:rPr>
-        <w:t>conformité</w:t>
-      </w:r>
-      <w:r>
-        <w:rPr>
-          <w:sz w:val="20"/>
-          <w:szCs w:val="20"/>
-        </w:rPr>
-        <w:t xml:space="preserve"> de l’ensemble des traitements de données.</w:t>
+        <w:t>Assurer la qualité, la sécurité, la traçabilité et la conformité de l’ensemble des traitements de données.</w:t>
       </w:r>
     </w:p>
     <w:p>
@@ -450,39 +303,7 @@
           <w:sz w:val="20"/>
           <w:szCs w:val="20"/>
         </w:rPr>
-        <w:t xml:space="preserve">Promouvoir une </w:t>
-      </w:r>
-      <w:r>
-        <w:rPr>
-          <w:b/>
-          <w:bCs/>
-          <w:sz w:val="20"/>
-          <w:szCs w:val="20"/>
-        </w:rPr>
-        <w:t>culture de responsabilité</w:t>
-      </w:r>
-      <w:r>
-        <w:rPr>
-          <w:sz w:val="20"/>
-          <w:szCs w:val="20"/>
-        </w:rPr>
-        <w:t xml:space="preserve"> et de </w:t>
-      </w:r>
-      <w:r>
-        <w:rPr>
-          <w:b/>
-          <w:bCs/>
-          <w:sz w:val="20"/>
-          <w:szCs w:val="20"/>
-        </w:rPr>
-        <w:t>transparence</w:t>
-      </w:r>
-      <w:r>
-        <w:rPr>
-          <w:sz w:val="20"/>
-          <w:szCs w:val="20"/>
-        </w:rPr>
-        <w:t xml:space="preserve"> vis-à-vis des usages de la donnée.</w:t>
+        <w:t>Promouvoir une culture de responsabilité et de transparence vis-à-vis des usages de la donnée.</w:t>
       </w:r>
     </w:p>
     <w:p>
@@ -502,63 +323,38 @@
           <w:sz w:val="20"/>
           <w:szCs w:val="20"/>
         </w:rPr>
-        <w:t xml:space="preserve">Soutenir l’innovation en maintenant un haut niveau de </w:t>
-      </w:r>
-      <w:r>
+        <w:t>Soutenir l’innovation en maintenant un haut niveau de maîtrise et d’intégrité des données.</w:t>
+      </w:r>
+    </w:p>
+    <w:p>
+      <w:pPr>
+        <w:ind w:left="720"/>
+        <w:jc w:val="both"/>
+        <w:rPr>
+          <w:sz w:val="20"/>
+          <w:szCs w:val="20"/>
+        </w:rPr>
+      </w:pPr>
+    </w:p>
+    <w:p>
+      <w:pPr>
+        <w:ind w:firstLine="708"/>
+        <w:jc w:val="both"/>
         <w:rPr>
           <w:b/>
           <w:bCs/>
           <w:sz w:val="20"/>
           <w:szCs w:val="20"/>
         </w:rPr>
-        <w:t>maîtrise et d’intégrité des données</w:t>
-      </w:r>
-      <w:r>
-        <w:rPr>
-          <w:sz w:val="20"/>
-          <w:szCs w:val="20"/>
-        </w:rPr>
-        <w:t>.</w:t>
-      </w:r>
-    </w:p>
-    <w:p>
-      <w:pPr>
-        <w:ind w:firstLine="708"/>
-        <w:jc w:val="both"/>
-        <w:rPr>
-          <w:sz w:val="20"/>
-          <w:szCs w:val="20"/>
-        </w:rPr>
-      </w:pPr>
-      <w:r>
-        <w:rPr>
-          <w:sz w:val="20"/>
-          <w:szCs w:val="20"/>
-        </w:rPr>
-        <w:pict w14:anchorId="791D26A2">
-          <v:rect id="_x0000_i1349" style="width:0;height:1.5pt" o:hralign="center" o:hrstd="t" o:hr="t" fillcolor="#a0a0a0" stroked="f"/>
-        </w:pict>
-      </w:r>
-    </w:p>
-    <w:p>
-      <w:pPr>
-        <w:ind w:firstLine="708"/>
-        <w:jc w:val="both"/>
+      </w:pPr>
+      <w:r>
         <w:rPr>
           <w:b/>
           <w:bCs/>
           <w:sz w:val="20"/>
           <w:szCs w:val="20"/>
         </w:rPr>
-      </w:pPr>
-      <w:r>
-        <w:rPr>
-          <w:b/>
-          <w:bCs/>
-          <w:sz w:val="20"/>
-          <w:szCs w:val="20"/>
-        </w:rPr>
-        <w:t xml:space="preserve"> Périmètre</w:t>
+        <w:t>Périmètre</w:t>
       </w:r>
     </w:p>
     <w:p>
@@ -610,23 +406,7 @@
           <w:sz w:val="20"/>
           <w:szCs w:val="20"/>
         </w:rPr>
-        <w:t xml:space="preserve">L’ensemble des </w:t>
-      </w:r>
-      <w:r>
-        <w:rPr>
-          <w:b/>
-          <w:bCs/>
-          <w:sz w:val="20"/>
-          <w:szCs w:val="20"/>
-        </w:rPr>
-        <w:t>équipes</w:t>
-      </w:r>
-      <w:r>
-        <w:rPr>
-          <w:sz w:val="20"/>
-          <w:szCs w:val="20"/>
-        </w:rPr>
-        <w:t xml:space="preserve"> (marketing, produit, tech, juridique, RH…).</w:t>
+        <w:t>L’ensemble des équipes (marketing, produit, tech, juridique, RH…).</w:t>
       </w:r>
     </w:p>
     <w:p>
@@ -646,23 +426,7 @@
           <w:sz w:val="20"/>
           <w:szCs w:val="20"/>
         </w:rPr>
-        <w:t xml:space="preserve">Tous les </w:t>
-      </w:r>
-      <w:r>
-        <w:rPr>
-          <w:b/>
-          <w:bCs/>
-          <w:sz w:val="20"/>
-          <w:szCs w:val="20"/>
-        </w:rPr>
-        <w:t>types de données</w:t>
-      </w:r>
-      <w:r>
-        <w:rPr>
-          <w:sz w:val="20"/>
-          <w:szCs w:val="20"/>
-        </w:rPr>
-        <w:t xml:space="preserve"> collectées, stockées ou analysées (utilisateurs, contenus, opérations, etc.).</w:t>
+        <w:t>Tous les types de données collectées, stockées ou analysées (utilisateurs, contenus, opérations, etc.).</w:t>
       </w:r>
     </w:p>
     <w:p>
@@ -718,43 +482,17 @@
           <w:sz w:val="20"/>
           <w:szCs w:val="20"/>
         </w:rPr>
-        <w:t xml:space="preserve">Tous les </w:t>
-      </w:r>
-      <w:r>
-        <w:rPr>
-          <w:b/>
-          <w:bCs/>
-          <w:sz w:val="20"/>
-          <w:szCs w:val="20"/>
-        </w:rPr>
-        <w:t>processus métiers</w:t>
-      </w:r>
-      <w:r>
-        <w:rPr>
-          <w:sz w:val="20"/>
-          <w:szCs w:val="20"/>
-        </w:rPr>
-        <w:t xml:space="preserve"> et projets recourant à des données.</w:t>
-      </w:r>
-    </w:p>
-    <w:p>
-      <w:pPr>
-        <w:ind w:firstLine="708"/>
+        <w:t>Tous les processus métiers et projets recourant à des données.</w:t>
+      </w:r>
+    </w:p>
+    <w:p>
+      <w:pPr>
         <w:jc w:val="both"/>
         <w:rPr>
           <w:sz w:val="20"/>
           <w:szCs w:val="20"/>
         </w:rPr>
       </w:pPr>
-      <w:r>
-        <w:rPr>
-          <w:sz w:val="20"/>
-          <w:szCs w:val="20"/>
-        </w:rPr>
-        <w:pict w14:anchorId="6E6003F8">
-          <v:rect id="_x0000_i1350" style="width:0;height:1.5pt" o:hralign="center" o:hrstd="t" o:hr="t" fillcolor="#a0a0a0" stroked="f"/>
-        </w:pict>
-      </w:r>
     </w:p>
     <w:p>
       <w:pPr>
@@ -869,22 +607,11 @@
           <w:sz w:val="20"/>
           <w:szCs w:val="20"/>
         </w:rPr>
-        <w:t xml:space="preserve">Un </w:t>
-      </w:r>
-      <w:r>
-        <w:rPr>
-          <w:b/>
-          <w:bCs/>
-          <w:sz w:val="20"/>
-          <w:szCs w:val="20"/>
-        </w:rPr>
-        <w:t xml:space="preserve">Chief Data </w:t>
+        <w:t xml:space="preserve">Un Chief Data </w:t>
       </w:r>
       <w:proofErr w:type="spellStart"/>
       <w:r>
         <w:rPr>
-          <w:b/>
-          <w:bCs/>
           <w:sz w:val="20"/>
           <w:szCs w:val="20"/>
         </w:rPr>
@@ -893,19 +620,10 @@
       <w:proofErr w:type="spellEnd"/>
       <w:r>
         <w:rPr>
-          <w:b/>
-          <w:bCs/>
-          <w:sz w:val="20"/>
-          <w:szCs w:val="20"/>
-        </w:rPr>
-        <w:t xml:space="preserve"> (CDO)</w:t>
-      </w:r>
-      <w:r>
-        <w:rPr>
-          <w:sz w:val="20"/>
-          <w:szCs w:val="20"/>
-        </w:rPr>
-        <w:t xml:space="preserve"> pilote la stratégie de gouvernance.</w:t>
+          <w:sz w:val="20"/>
+          <w:szCs w:val="20"/>
+        </w:rPr>
+        <w:t xml:space="preserve"> (CDO) pilote la stratégie de gouvernance.</w:t>
       </w:r>
     </w:p>
     <w:p>
@@ -930,8 +648,6 @@
       <w:proofErr w:type="gramStart"/>
       <w:r>
         <w:rPr>
-          <w:b/>
-          <w:bCs/>
           <w:sz w:val="20"/>
           <w:szCs w:val="20"/>
         </w:rPr>
@@ -940,19 +656,10 @@
       <w:proofErr w:type="gramEnd"/>
       <w:r>
         <w:rPr>
-          <w:b/>
-          <w:bCs/>
-          <w:sz w:val="20"/>
-          <w:szCs w:val="20"/>
-        </w:rPr>
-        <w:t xml:space="preserve"> Stewards</w:t>
-      </w:r>
-      <w:r>
-        <w:rPr>
-          <w:sz w:val="20"/>
-          <w:szCs w:val="20"/>
-        </w:rPr>
-        <w:t>.</w:t>
+          <w:sz w:val="20"/>
+          <w:szCs w:val="20"/>
+        </w:rPr>
+        <w:t xml:space="preserve"> Stewards.</w:t>
       </w:r>
     </w:p>
     <w:p>
@@ -972,23 +679,7 @@
           <w:sz w:val="20"/>
           <w:szCs w:val="20"/>
         </w:rPr>
-        <w:t xml:space="preserve">Les </w:t>
-      </w:r>
-      <w:r>
-        <w:rPr>
-          <w:b/>
-          <w:bCs/>
-          <w:sz w:val="20"/>
-          <w:szCs w:val="20"/>
-        </w:rPr>
-        <w:t>rôles et responsabilités</w:t>
-      </w:r>
-      <w:r>
-        <w:rPr>
-          <w:sz w:val="20"/>
-          <w:szCs w:val="20"/>
-        </w:rPr>
-        <w:t xml:space="preserve"> sont formalisés et connus de tous.</w:t>
+        <w:t>Les rôles et responsabilités sont formalisés et connus de tous.</w:t>
       </w:r>
     </w:p>
     <w:p>
@@ -1000,15 +691,6 @@
           <w:szCs w:val="20"/>
         </w:rPr>
       </w:pPr>
-      <w:r>
-        <w:rPr>
-          <w:sz w:val="20"/>
-          <w:szCs w:val="20"/>
-        </w:rPr>
-        <w:pict w14:anchorId="74852951">
-          <v:rect id="_x0000_i1351" style="width:0;height:1.5pt" o:hralign="center" o:hrstd="t" o:hr="t" fillcolor="#a0a0a0" stroked="f"/>
-        </w:pict>
-      </w:r>
     </w:p>
     <w:p>
       <w:pPr>
@@ -1066,23 +748,7 @@
           <w:sz w:val="20"/>
           <w:szCs w:val="20"/>
         </w:rPr>
-        <w:t xml:space="preserve">Mise à disposition de </w:t>
-      </w:r>
-      <w:r>
-        <w:rPr>
-          <w:b/>
-          <w:bCs/>
-          <w:sz w:val="20"/>
-          <w:szCs w:val="20"/>
-        </w:rPr>
-        <w:t>notices de confidentialité</w:t>
-      </w:r>
-      <w:r>
-        <w:rPr>
-          <w:sz w:val="20"/>
-          <w:szCs w:val="20"/>
-        </w:rPr>
-        <w:t xml:space="preserve"> simples et accessibles.</w:t>
+        <w:t>Mise à disposition de notices de confidentialité simples et accessibles.</w:t>
       </w:r>
     </w:p>
     <w:p>
@@ -1102,23 +768,7 @@
           <w:sz w:val="20"/>
           <w:szCs w:val="20"/>
         </w:rPr>
-        <w:t xml:space="preserve">Gestion explicite des </w:t>
-      </w:r>
-      <w:r>
-        <w:rPr>
-          <w:b/>
-          <w:bCs/>
-          <w:sz w:val="20"/>
-          <w:szCs w:val="20"/>
-        </w:rPr>
-        <w:t>consentements</w:t>
-      </w:r>
-      <w:r>
-        <w:rPr>
-          <w:sz w:val="20"/>
-          <w:szCs w:val="20"/>
-        </w:rPr>
-        <w:t xml:space="preserve"> (opt-in/opt-out).</w:t>
+        <w:t>Gestion explicite des consentements (opt-in/opt-out).</w:t>
       </w:r>
     </w:p>
     <w:p>
@@ -1138,43 +788,17 @@
           <w:sz w:val="20"/>
           <w:szCs w:val="20"/>
         </w:rPr>
-        <w:t xml:space="preserve">Respect des principes de </w:t>
-      </w:r>
-      <w:r>
-        <w:rPr>
-          <w:b/>
-          <w:bCs/>
-          <w:sz w:val="20"/>
-          <w:szCs w:val="20"/>
-        </w:rPr>
-        <w:t>loyauté</w:t>
-      </w:r>
-      <w:r>
-        <w:rPr>
-          <w:sz w:val="20"/>
-          <w:szCs w:val="20"/>
-        </w:rPr>
-        <w:t xml:space="preserve"> et de traçabilité.</w:t>
-      </w:r>
-    </w:p>
-    <w:p>
-      <w:pPr>
-        <w:ind w:firstLine="708"/>
+        <w:t>Respect des principes de loyauté et de traçabilité.</w:t>
+      </w:r>
+    </w:p>
+    <w:p>
+      <w:pPr>
         <w:jc w:val="both"/>
         <w:rPr>
           <w:sz w:val="20"/>
           <w:szCs w:val="20"/>
         </w:rPr>
       </w:pPr>
-      <w:r>
-        <w:rPr>
-          <w:sz w:val="20"/>
-          <w:szCs w:val="20"/>
-        </w:rPr>
-        <w:pict w14:anchorId="338EFBBE">
-          <v:rect id="_x0000_i1360" style="width:0;height:1.5pt" o:hralign="center" o:hrstd="t" o:hr="t" fillcolor="#a0a0a0" stroked="f"/>
-        </w:pict>
-      </w:r>
     </w:p>
     <w:p>
       <w:pPr>
@@ -1276,22 +900,12 @@
     </w:p>
     <w:p>
       <w:pPr>
-        <w:ind w:firstLine="708"/>
         <w:jc w:val="both"/>
         <w:rPr>
           <w:sz w:val="20"/>
           <w:szCs w:val="20"/>
         </w:rPr>
       </w:pPr>
-      <w:r>
-        <w:rPr>
-          <w:sz w:val="20"/>
-          <w:szCs w:val="20"/>
-        </w:rPr>
-        <w:pict w14:anchorId="0F5C707B">
-          <v:rect id="_x0000_i1352" style="width:0;height:1.5pt" o:hralign="center" o:hrstd="t" o:hr="t" fillcolor="#a0a0a0" stroked="f"/>
-        </w:pict>
-      </w:r>
     </w:p>
     <w:p>
       <w:pPr>
@@ -1348,23 +962,7 @@
           <w:sz w:val="20"/>
           <w:szCs w:val="20"/>
         </w:rPr>
-        <w:t>Mise en place d’</w:t>
-      </w:r>
-      <w:r>
-        <w:rPr>
-          <w:b/>
-          <w:bCs/>
-          <w:sz w:val="20"/>
-          <w:szCs w:val="20"/>
-        </w:rPr>
-        <w:t>indicateurs de qualité</w:t>
-      </w:r>
-      <w:r>
-        <w:rPr>
-          <w:sz w:val="20"/>
-          <w:szCs w:val="20"/>
-        </w:rPr>
-        <w:t xml:space="preserve"> (complétude, cohérence…).</w:t>
+        <w:t>Mise en place d’indicateurs de qualité (complétude, cohérence…).</w:t>
       </w:r>
     </w:p>
     <w:p>
@@ -1381,19 +979,10 @@
       </w:pPr>
       <w:r>
         <w:rPr>
-          <w:b/>
-          <w:bCs/>
-          <w:sz w:val="20"/>
-          <w:szCs w:val="20"/>
-        </w:rPr>
-        <w:t>Audits réguliers</w:t>
-      </w:r>
-      <w:r>
-        <w:rPr>
-          <w:sz w:val="20"/>
-          <w:szCs w:val="20"/>
-        </w:rPr>
-        <w:t xml:space="preserve"> des </w:t>
+          <w:sz w:val="20"/>
+          <w:szCs w:val="20"/>
+        </w:rPr>
+        <w:t xml:space="preserve">Audits réguliers des </w:t>
       </w:r>
       <w:proofErr w:type="spellStart"/>
       <w:r>
@@ -1429,23 +1018,7 @@
           <w:sz w:val="20"/>
           <w:szCs w:val="20"/>
         </w:rPr>
-        <w:t xml:space="preserve">Processus de </w:t>
-      </w:r>
-      <w:r>
-        <w:rPr>
-          <w:b/>
-          <w:bCs/>
-          <w:sz w:val="20"/>
-          <w:szCs w:val="20"/>
-        </w:rPr>
-        <w:t>nettoyage et validation</w:t>
-      </w:r>
-      <w:r>
-        <w:rPr>
-          <w:sz w:val="20"/>
-          <w:szCs w:val="20"/>
-        </w:rPr>
-        <w:t xml:space="preserve"> dans les pipelines.</w:t>
+        <w:t>Processus de nettoyage et validation dans les pipelines.</w:t>
       </w:r>
     </w:p>
     <w:p>
@@ -1457,15 +1030,6 @@
           <w:szCs w:val="20"/>
         </w:rPr>
       </w:pPr>
-      <w:r>
-        <w:rPr>
-          <w:sz w:val="20"/>
-          <w:szCs w:val="20"/>
-        </w:rPr>
-        <w:pict w14:anchorId="6853EAF5">
-          <v:rect id="_x0000_i1353" style="width:0;height:1.5pt" o:hralign="center" o:hrstd="t" o:hr="t" fillcolor="#a0a0a0" stroked="f"/>
-        </w:pict>
-      </w:r>
     </w:p>
     <w:p>
       <w:pPr>
@@ -1522,22 +1086,11 @@
           <w:sz w:val="20"/>
           <w:szCs w:val="20"/>
         </w:rPr>
-        <w:t xml:space="preserve">Nomination d’un </w:t>
-      </w:r>
-      <w:r>
-        <w:rPr>
-          <w:b/>
-          <w:bCs/>
-          <w:sz w:val="20"/>
-          <w:szCs w:val="20"/>
-        </w:rPr>
-        <w:t xml:space="preserve">Data Protection </w:t>
+        <w:t xml:space="preserve">Nomination d’un Data Protection </w:t>
       </w:r>
       <w:proofErr w:type="spellStart"/>
       <w:r>
         <w:rPr>
-          <w:b/>
-          <w:bCs/>
           <w:sz w:val="20"/>
           <w:szCs w:val="20"/>
         </w:rPr>
@@ -1546,19 +1099,10 @@
       <w:proofErr w:type="spellEnd"/>
       <w:r>
         <w:rPr>
-          <w:b/>
-          <w:bCs/>
-          <w:sz w:val="20"/>
-          <w:szCs w:val="20"/>
-        </w:rPr>
-        <w:t xml:space="preserve"> (DPO)</w:t>
-      </w:r>
-      <w:r>
-        <w:rPr>
-          <w:sz w:val="20"/>
-          <w:szCs w:val="20"/>
-        </w:rPr>
-        <w:t>.</w:t>
+          <w:sz w:val="20"/>
+          <w:szCs w:val="20"/>
+        </w:rPr>
+        <w:t xml:space="preserve"> (DPO).</w:t>
       </w:r>
     </w:p>
     <w:p>
@@ -1628,23 +1172,7 @@
           <w:sz w:val="20"/>
           <w:szCs w:val="20"/>
         </w:rPr>
-        <w:t xml:space="preserve">Veille réglementaire continue et </w:t>
-      </w:r>
-      <w:r>
-        <w:rPr>
-          <w:b/>
-          <w:bCs/>
-          <w:sz w:val="20"/>
-          <w:szCs w:val="20"/>
-        </w:rPr>
-        <w:t>revue annuelle</w:t>
-      </w:r>
-      <w:r>
-        <w:rPr>
-          <w:sz w:val="20"/>
-          <w:szCs w:val="20"/>
-        </w:rPr>
-        <w:t xml:space="preserve"> de conformité.</w:t>
+        <w:t>Veille réglementaire continue et revue annuelle de conformité.</w:t>
       </w:r>
     </w:p>
     <w:p>
@@ -1656,15 +1184,6 @@
           <w:szCs w:val="20"/>
         </w:rPr>
       </w:pPr>
-      <w:r>
-        <w:rPr>
-          <w:sz w:val="20"/>
-          <w:szCs w:val="20"/>
-        </w:rPr>
-        <w:pict w14:anchorId="7669B5C2">
-          <v:rect id="_x0000_i1354" style="width:0;height:1.5pt" o:hralign="center" o:hrstd="t" o:hr="t" fillcolor="#a0a0a0" stroked="f"/>
-        </w:pict>
-      </w:r>
     </w:p>
     <w:p>
       <w:pPr>
@@ -1721,23 +1240,7 @@
           <w:sz w:val="20"/>
           <w:szCs w:val="20"/>
         </w:rPr>
-        <w:t xml:space="preserve">Revue systématique des </w:t>
-      </w:r>
-      <w:r>
-        <w:rPr>
-          <w:b/>
-          <w:bCs/>
-          <w:sz w:val="20"/>
-          <w:szCs w:val="20"/>
-        </w:rPr>
-        <w:t>formulaires</w:t>
-      </w:r>
-      <w:r>
-        <w:rPr>
-          <w:sz w:val="20"/>
-          <w:szCs w:val="20"/>
-        </w:rPr>
-        <w:t xml:space="preserve"> et des scripts de collecte.</w:t>
+        <w:t>Revue systématique des formulaires et des scripts de collecte.</w:t>
       </w:r>
     </w:p>
     <w:p>
@@ -1769,15 +1272,6 @@
           <w:szCs w:val="20"/>
         </w:rPr>
       </w:pPr>
-      <w:r>
-        <w:rPr>
-          <w:sz w:val="20"/>
-          <w:szCs w:val="20"/>
-        </w:rPr>
-        <w:pict w14:anchorId="506EBDE0">
-          <v:rect id="_x0000_i1355" style="width:0;height:1.5pt" o:hralign="center" o:hrstd="t" o:hr="t" fillcolor="#a0a0a0" stroked="f"/>
-        </w:pict>
-      </w:r>
     </w:p>
     <w:p>
       <w:pPr>
@@ -1887,15 +1381,6 @@
           <w:szCs w:val="20"/>
         </w:rPr>
       </w:pPr>
-      <w:r>
-        <w:rPr>
-          <w:sz w:val="20"/>
-          <w:szCs w:val="20"/>
-        </w:rPr>
-        <w:pict w14:anchorId="43771184">
-          <v:rect id="_x0000_i1356" style="width:0;height:1.5pt" o:hralign="center" o:hrstd="t" o:hr="t" fillcolor="#a0a0a0" stroked="f"/>
-        </w:pict>
-      </w:r>
     </w:p>
     <w:p>
       <w:pPr>
@@ -2004,15 +1489,6 @@
           <w:szCs w:val="20"/>
         </w:rPr>
       </w:pPr>
-      <w:r>
-        <w:rPr>
-          <w:sz w:val="20"/>
-          <w:szCs w:val="20"/>
-        </w:rPr>
-        <w:pict w14:anchorId="49E7D84F">
-          <v:rect id="_x0000_i1357" style="width:0;height:1.5pt" o:hralign="center" o:hrstd="t" o:hr="t" fillcolor="#a0a0a0" stroked="f"/>
-        </w:pict>
-      </w:r>
     </w:p>
     <w:p>
       <w:pPr>
@@ -2069,23 +1545,7 @@
           <w:sz w:val="20"/>
           <w:szCs w:val="20"/>
         </w:rPr>
-        <w:t xml:space="preserve">Evaluation des </w:t>
-      </w:r>
-      <w:r>
-        <w:rPr>
-          <w:b/>
-          <w:bCs/>
-          <w:sz w:val="20"/>
-          <w:szCs w:val="20"/>
-        </w:rPr>
-        <w:t>biais algorithmiques</w:t>
-      </w:r>
-      <w:r>
-        <w:rPr>
-          <w:sz w:val="20"/>
-          <w:szCs w:val="20"/>
-        </w:rPr>
-        <w:t xml:space="preserve"> dans les systèmes de recommandation.</w:t>
+        <w:t>Evaluation des biais algorithmiques dans les systèmes de recommandation.</w:t>
       </w:r>
     </w:p>
     <w:p>
@@ -2137,15 +1597,6 @@
           <w:szCs w:val="20"/>
         </w:rPr>
       </w:pPr>
-      <w:r>
-        <w:rPr>
-          <w:sz w:val="20"/>
-          <w:szCs w:val="20"/>
-        </w:rPr>
-        <w:pict w14:anchorId="5E6222FE">
-          <v:rect id="_x0000_i1358" style="width:0;height:1.5pt" o:hralign="center" o:hrstd="t" o:hr="t" fillcolor="#a0a0a0" stroked="f"/>
-        </w:pict>
-      </w:r>
     </w:p>
     <w:p>
       <w:pPr>
@@ -2182,23 +1633,7 @@
           <w:sz w:val="20"/>
           <w:szCs w:val="20"/>
         </w:rPr>
-        <w:t xml:space="preserve">Cette politique est revue </w:t>
-      </w:r>
-      <w:r>
-        <w:rPr>
-          <w:b/>
-          <w:bCs/>
-          <w:sz w:val="20"/>
-          <w:szCs w:val="20"/>
-        </w:rPr>
-        <w:t>chaque année</w:t>
-      </w:r>
-      <w:r>
-        <w:rPr>
-          <w:sz w:val="20"/>
-          <w:szCs w:val="20"/>
-        </w:rPr>
-        <w:t xml:space="preserve"> ou à l’occasion</w:t>
+        <w:t>Cette politique est revue chaque année ou à l’occasion</w:t>
       </w:r>
       <w:r>
         <w:rPr>
@@ -2285,15 +1720,6 @@
           <w:szCs w:val="20"/>
         </w:rPr>
       </w:pPr>
-      <w:r>
-        <w:rPr>
-          <w:sz w:val="20"/>
-          <w:szCs w:val="20"/>
-        </w:rPr>
-        <w:pict w14:anchorId="796FA750">
-          <v:rect id="_x0000_i1359" style="width:0;height:1.5pt" o:hralign="center" o:hrstd="t" o:hr="t" fillcolor="#a0a0a0" stroked="f"/>
-        </w:pict>
-      </w:r>
     </w:p>
     <w:p>
       <w:pPr>
@@ -2330,23 +1756,7 @@
           <w:sz w:val="20"/>
           <w:szCs w:val="20"/>
         </w:rPr>
-        <w:t xml:space="preserve">La présente politique est un </w:t>
-      </w:r>
-      <w:r>
-        <w:rPr>
-          <w:b/>
-          <w:bCs/>
-          <w:sz w:val="20"/>
-          <w:szCs w:val="20"/>
-        </w:rPr>
-        <w:t>engagement collectif</w:t>
-      </w:r>
-      <w:r>
-        <w:rPr>
-          <w:sz w:val="20"/>
-          <w:szCs w:val="20"/>
-        </w:rPr>
-        <w:t xml:space="preserve"> à placer la donnée au service de la performance, de la confiance et de la responsabilité. Chaque collaborateur, chaque service, chaque projet a un rôle à jouer dans la mise en œuvre d’une gouvernance de la donnée robuste, éthique et durable.</w:t>
+        <w:t>La présente politique est un engagement collectif à placer la donnée au service de la performance, de la confiance et de la responsabilité. Chaque collaborateur, chaque service, chaque projet a un rôle à jouer dans la mise en œuvre d’une gouvernance de la donnée robuste, éthique et durable.</w:t>
       </w:r>
     </w:p>
     <w:p>
@@ -2472,6 +1882,7 @@
         <w:rPr>
           <w:b/>
           <w:bCs/>
+          <w:noProof/>
         </w:rPr>
         <w:drawing>
           <wp:inline distT="0" distB="0" distL="0" distR="0" wp14:anchorId="6DE6DB76" wp14:editId="0D39EC0A">
@@ -8788,6 +8199,7 @@
   <w:style w:type="character" w:default="1" w:styleId="Policepardfaut">
     <w:name w:val="Default Paragraph Font"/>
     <w:uiPriority w:val="1"/>
+    <w:semiHidden/>
     <w:unhideWhenUsed/>
   </w:style>
   <w:style w:type="table" w:default="1" w:styleId="TableauNormal">

</xml_diff>